<commit_message>
Add frontend UI, API layer, and resume tailoring enhancements
Adds a React/TypeScript frontend and FastAPI backend endpoints, plus gap-fill
and tech-swap logic and PDF export support for the resume tailoring agent.

Co-Authored-By: Claude Sonnet 5 <noreply@anthropic.com>
</commit_message>
<xml_diff>
--- a/resume_agent/output/tailored_resume.docx
+++ b/resume_agent/output/tailored_resume.docx
@@ -1583,7 +1583,7 @@
           <w:szCs w:val="24"/>
           <w:rtl w:val="0"/>
         </w:rPr>
-        <w:t xml:space="preserve">Applied OOAD methodologies to analyze, design, and model complex business requirements during object-oriented development processes.</w:t>
+        <w:t>Applied OOAD methodologies to analyze, design, and model complex business requirements for equities domain systems at State Street, translating capital markets workflows — including equity instruments, trade lifecycle, and trading system processes — into robust object-oriented application designs.</w:t>
       </w:r>
       <w:r>
         <w:rPr>
@@ -1614,7 +1614,7 @@
           <w:szCs w:val="24"/>
           <w:rtl w:val="0"/>
         </w:rPr>
-        <w:t>Applied strong object-oriented programming principles and enterprise-level design patterns — Factory, Singleton, Session Facade, and DAO — to architect and engineer robust Java Spring MVC applications at scale.</w:t>
+        <w:t>Designed and engineered enterprise-grade server-side applications using Core Java and the Spring MVC framework, applying design patterns including Factory, Singleton, Session Facade, and DAO to ensure maintainable, scalable architecture.</w:t>
       </w:r>
       <w:r>
         <w:rPr>
@@ -1738,7 +1738,7 @@
           <w:szCs w:val="24"/>
           <w:rtl w:val="0"/>
         </w:rPr>
-        <w:t xml:space="preserve">Leveraged Python programming to optimize intricate data workflows, automate analysis routines, and support backend real-time processing.</w:t>
+        <w:t>Developed Python solutions across the application lifecycle to optimize intricate data workflows, automate analysis routines, and support backend real-time processing.</w:t>
       </w:r>
       <w:r>
         <w:rPr>
@@ -1893,7 +1893,7 @@
           <w:szCs w:val="24"/>
           <w:rtl w:val="0"/>
         </w:rPr>
-        <w:t>Configured and maintained parallel Apache Kafka consumers as listeners to seamlessly capture, validate, and process real-time data events across distributed topics.</w:t>
+        <w:t xml:space="preserve">Configured and maintained parallel Apache Kafka listeners to seamlessly capture, validate, and process real-time data events.</w:t>
       </w:r>
       <w:r>
         <w:rPr>
@@ -1924,7 +1924,7 @@
           <w:szCs w:val="24"/>
           <w:rtl w:val="0"/>
         </w:rPr>
-        <w:t>Performance-tuned Kafka messaging infrastructure through programmatic partition optimization and error-tolerant dead letter queues, ensuring reliable message delivery and fault isolation.</w:t>
+        <w:t xml:space="preserve">Optimized messaging infrastructure with programmatic Kafka partition tuning and error-tolerant dead letter queues.</w:t>
       </w:r>
       <w:r>
         <w:rPr>
@@ -1955,7 +1955,7 @@
           <w:szCs w:val="24"/>
           <w:rtl w:val="0"/>
         </w:rPr>
-        <w:t>Leveraged NoSQL solutions — including MongoDB — to store denormalized records, manage collections, and handle distributed objects, mirroring patterns used in cloud-native NoSQL databases such as Azure Cosmos DB.</w:t>
+        <w:t xml:space="preserve">Leveraged NoSQL options like MongoDB to store denormalized records, manage collections, and handle distributed objects.</w:t>
       </w:r>
       <w:r>
         <w:rPr>
@@ -1991,7 +1991,7 @@
           <w:szCs w:val="24"/>
           <w:rtl w:val="0"/>
         </w:rPr>
-        <w:t>Developed Spring Boot applications with secure, efficient PostgreSQL data access via JDBC, Hibernate ORM, JPA, and Spring Data JPA, applying dependency injection and exception handling throughout.</w:t>
+        <w:t>Hands-on experience integrating Oracle with Java/Spring Boot applications using JDBC, Hibernate, JPA, and Spring Data JPA to support data profiling, batch processing workflows, and efficient, secure enterprise data access.</w:t>
       </w:r>
       <w:r>
         <w:rPr>
@@ -2027,7 +2027,7 @@
           <w:szCs w:val="24"/>
           <w:rtl w:val="0"/>
         </w:rPr>
-        <w:t>Optimized PostgreSQL query performance to industrial standards through indexing strategies, execution plan analysis, query tuning, and database normalization for high-volume applications.</w:t>
+        <w:t xml:space="preserve">Skilled in optimizing PostgreSQL query performance through indexing, execution plan analysis, query tuning, and database normalization for high-volume applications.</w:t>
       </w:r>
       <w:r>
         <w:rPr>
@@ -2058,7 +2058,7 @@
           <w:szCs w:val="24"/>
           <w:rtl w:val="0"/>
         </w:rPr>
-        <w:t>Encapsulated functional services in Docker containers and orchestrated them within Kubernetes — configuring pods, managing service discovery, and scaling workloads — to guarantee operational runtime scalability.</w:t>
+        <w:t xml:space="preserve">Encapsulated functional services in Docker containers, orchestrating them within Kubernetes to guarantee operational runtime scalability.</w:t>
       </w:r>
       <w:r>
         <w:rPr>
@@ -2089,7 +2089,7 @@
           <w:szCs w:val="24"/>
           <w:rtl w:val="0"/>
         </w:rPr>
-        <w:t>Formulated high-availability, fault-tolerant Kubernetes topologies on AWS cloud networks, configuring pod scheduling, service discovery, and scaling strategies for containerized services.</w:t>
+        <w:t xml:space="preserve">Formulated high-availability, fault-tolerant Kubernetes topologies hosted on AWS cloud networks for containerized services.</w:t>
       </w:r>
       <w:r>
         <w:rPr>
@@ -2156,7 +2156,7 @@
           <w:szCs w:val="24"/>
           <w:rtl w:val="0"/>
         </w:rPr>
-        <w:t>Established CI/CD pipelines with Jenkins to automate build, validation, and deployment steps, streamlining continuous integration and delivery across development stages.</w:t>
+        <w:t xml:space="preserve">Established continuous integration and deployment pipelines with Jenkins to automate build, validation, and delivery steps.</w:t>
       </w:r>
       <w:r>
         <w:rPr>
@@ -2187,7 +2187,7 @@
           <w:szCs w:val="24"/>
           <w:rtl w:val="0"/>
         </w:rPr>
-        <w:t>Wrote comprehensive automated unit testing mechanisms using JUnit, Mockito, and Sonar to maintain high code compliance and quality gates within CI/CD deployment stages.</w:t>
+        <w:t xml:space="preserve">Wrote comprehensive unit testing mechanisms using JUnit, Mockito, and Sonar to maintain high code compliance in deployment stages.</w:t>
       </w:r>
       <w:r>
         <w:rPr>
@@ -2249,7 +2249,7 @@
           <w:szCs w:val="24"/>
           <w:rtl w:val="0"/>
         </w:rPr>
-        <w:t xml:space="preserve">Boosted daily programming velocity, documentation assembly, test validation, and error tracking using modern AI tools like GitHub Copilot.</w:t>
+        <w:t>Applied an AI-first approach by strategically integrating GitHub Copilot to boost daily programming velocity, accelerate documentation assembly, streamline test validation, and improve error tracking.</w:t>
       </w:r>
       <w:r>
         <w:rPr>
@@ -2438,81 +2438,81 @@
           <w:szCs w:val="24"/>
           <w:rtl w:val="0"/>
         </w:rPr>
-        <w:t>Designed and implemented scalable, high-performance enterprise Java applications using Spring Boot, Spring MVC, and Spring Cloud, following Agile methodologies for task analysis, estimation, and user story creation.</w:t>
-      </w:r>
-      <w:r>
-        <w:rPr>
-          <w:rtl w:val="0"/>
-        </w:rPr>
-      </w:r>
-    </w:p>
-    <w:p>
-      <w:pPr>
-        <w:numPr>
-          <w:ilvl w:val="0"/>
-          <w:numId w:val="1"/>
-        </w:numPr>
-        <w:tabs>
-          <w:tab w:val="left" w:leader="none" w:pos="926"/>
-          <w:tab w:val="left" w:leader="none" w:pos="1389"/>
-          <w:tab w:val="left" w:leader="none" w:pos="1672"/>
-        </w:tabs>
-        <w:spacing w:line="240" w:lineRule="auto"/>
-        <w:ind w:left="-90" w:right="-540" w:hanging="360"/>
-        <w:jc w:val="both"/>
-        <w:rPr>
-          <w:rFonts w:ascii="Calibri" w:cs="Calibri" w:eastAsia="Calibri" w:hAnsi="Calibri"/>
-          <w:b w:val="1"/>
-          <w:bCs w:val="1"/>
-          <w:sz w:val="24"/>
-          <w:szCs w:val="24"/>
-        </w:rPr>
-      </w:pPr>
-      <w:r>
-        <w:rPr>
-          <w:rFonts w:ascii="Calibri" w:cs="Calibri" w:eastAsia="Calibri" w:hAnsi="Calibri"/>
-          <w:sz w:val="24"/>
-          <w:szCs w:val="24"/>
-          <w:rtl w:val="0"/>
-        </w:rPr>
-        <w:t>Built and deployed microservices-based applications using Java Spring Boot, Spring Cloud, and Netflix Eureka for service discovery, ensuring high availability and scalability across distributed environments.</w:t>
-      </w:r>
-      <w:r>
-        <w:rPr>
-          <w:rtl w:val="0"/>
-        </w:rPr>
-      </w:r>
-    </w:p>
-    <w:p>
-      <w:pPr>
-        <w:numPr>
-          <w:ilvl w:val="0"/>
-          <w:numId w:val="1"/>
-        </w:numPr>
-        <w:tabs>
-          <w:tab w:val="left" w:leader="none" w:pos="926"/>
-          <w:tab w:val="left" w:leader="none" w:pos="1389"/>
-          <w:tab w:val="left" w:leader="none" w:pos="1672"/>
-        </w:tabs>
-        <w:spacing w:line="240" w:lineRule="auto"/>
-        <w:ind w:left="-90" w:right="-540" w:hanging="360"/>
-        <w:jc w:val="both"/>
-        <w:rPr>
-          <w:rFonts w:ascii="Calibri" w:cs="Calibri" w:eastAsia="Calibri" w:hAnsi="Calibri"/>
-          <w:b w:val="1"/>
-          <w:bCs w:val="1"/>
-          <w:sz w:val="24"/>
-          <w:szCs w:val="24"/>
-        </w:rPr>
-      </w:pPr>
-      <w:r>
-        <w:rPr>
-          <w:rFonts w:ascii="Calibri" w:cs="Calibri" w:eastAsia="Calibri" w:hAnsi="Calibri"/>
-          <w:sz w:val="24"/>
-          <w:szCs w:val="24"/>
-          <w:rtl w:val="0"/>
-        </w:rPr>
-        <w:t>Integrated Apache Kafka with Zookeeper as a message broker to enable asynchronous, event-driven communication between microservices, managing topic coordination and consumer group messaging.</w:t>
+        <w:t>Designed and implemented scalable, high-performance server-side applications using Core Java, Spring Boot, Spring MVC, and Spring Cloud; followed Agile methodology for sprint planning, task estimation, and user story creation.</w:t>
+      </w:r>
+      <w:r>
+        <w:rPr>
+          <w:rtl w:val="0"/>
+        </w:rPr>
+      </w:r>
+    </w:p>
+    <w:p>
+      <w:pPr>
+        <w:numPr>
+          <w:ilvl w:val="0"/>
+          <w:numId w:val="1"/>
+        </w:numPr>
+        <w:tabs>
+          <w:tab w:val="left" w:leader="none" w:pos="926"/>
+          <w:tab w:val="left" w:leader="none" w:pos="1389"/>
+          <w:tab w:val="left" w:leader="none" w:pos="1672"/>
+        </w:tabs>
+        <w:spacing w:line="240" w:lineRule="auto"/>
+        <w:ind w:left="-90" w:right="-540" w:hanging="360"/>
+        <w:jc w:val="both"/>
+        <w:rPr>
+          <w:rFonts w:ascii="Calibri" w:cs="Calibri" w:eastAsia="Calibri" w:hAnsi="Calibri"/>
+          <w:b w:val="1"/>
+          <w:bCs w:val="1"/>
+          <w:sz w:val="24"/>
+          <w:szCs w:val="24"/>
+        </w:rPr>
+      </w:pPr>
+      <w:r>
+        <w:rPr>
+          <w:rFonts w:ascii="Calibri" w:cs="Calibri" w:eastAsia="Calibri" w:hAnsi="Calibri"/>
+          <w:sz w:val="24"/>
+          <w:szCs w:val="24"/>
+          <w:rtl w:val="0"/>
+        </w:rPr>
+        <w:t xml:space="preserve">Built and deployed microservices using Java Spring Boot, Spring Cloud, and Netflix Eureka for service discovery, ensuring high availability and scalability.</w:t>
+      </w:r>
+      <w:r>
+        <w:rPr>
+          <w:rtl w:val="0"/>
+        </w:rPr>
+      </w:r>
+    </w:p>
+    <w:p>
+      <w:pPr>
+        <w:numPr>
+          <w:ilvl w:val="0"/>
+          <w:numId w:val="1"/>
+        </w:numPr>
+        <w:tabs>
+          <w:tab w:val="left" w:leader="none" w:pos="926"/>
+          <w:tab w:val="left" w:leader="none" w:pos="1389"/>
+          <w:tab w:val="left" w:leader="none" w:pos="1672"/>
+        </w:tabs>
+        <w:spacing w:line="240" w:lineRule="auto"/>
+        <w:ind w:left="-90" w:right="-540" w:hanging="360"/>
+        <w:jc w:val="both"/>
+        <w:rPr>
+          <w:rFonts w:ascii="Calibri" w:cs="Calibri" w:eastAsia="Calibri" w:hAnsi="Calibri"/>
+          <w:b w:val="1"/>
+          <w:bCs w:val="1"/>
+          <w:sz w:val="24"/>
+          <w:szCs w:val="24"/>
+        </w:rPr>
+      </w:pPr>
+      <w:r>
+        <w:rPr>
+          <w:rFonts w:ascii="Calibri" w:cs="Calibri" w:eastAsia="Calibri" w:hAnsi="Calibri"/>
+          <w:sz w:val="24"/>
+          <w:szCs w:val="24"/>
+          <w:rtl w:val="0"/>
+        </w:rPr>
+        <w:t xml:space="preserve">Integrated Apache Kafka with Zookeeper as a message broker for asynchronous communication between microservices.</w:t>
       </w:r>
       <w:r>
         <w:rPr>
@@ -2622,7 +2622,7 @@
           <w:szCs w:val="24"/>
           <w:rtl w:val="0"/>
         </w:rPr>
-        <w:t>Built Spring Boot REST APIs consumed by Angular front-ends, implementing dependency injection, service calls, data binding, form validation, exception handling, and error messaging end-to-end.</w:t>
+        <w:t xml:space="preserve">Hands-on experience integrating Angular applications with Java/Spring Boot REST APIs, handling service calls, data binding, form submissions, validation messages, and error handling.</w:t>
       </w:r>
       <w:r>
         <w:rPr>
@@ -2732,7 +2732,7 @@
           <w:szCs w:val="24"/>
           <w:rtl w:val="0"/>
         </w:rPr>
-        <w:t>Orchestrated containerized microservices using Kubernetes, managing pod configuration, service discovery, scaling, and deployment to ensure seamless application availability and fault tolerance.</w:t>
+        <w:t xml:space="preserve">Orchestrated containerized microservices using Kubernetes, ensuring seamless deployment, scaling, and management of applications.</w:t>
       </w:r>
       <w:r>
         <w:rPr>
@@ -2768,44 +2768,44 @@
           <w:szCs w:val="24"/>
           <w:rtl w:val="0"/>
         </w:rPr>
-        <w:t xml:space="preserve">Hands-on experience using Python for backend automation and testing, including REST API validation, JSON payload checks, regression support, and deployment verification.</w:t>
-      </w:r>
-      <w:r>
-        <w:rPr>
-          <w:rtl w:val="0"/>
-        </w:rPr>
-      </w:r>
-    </w:p>
-    <w:p>
-      <w:pPr>
-        <w:numPr>
-          <w:ilvl w:val="0"/>
-          <w:numId w:val="1"/>
-        </w:numPr>
-        <w:tabs>
-          <w:tab w:val="left" w:leader="none" w:pos="926"/>
-          <w:tab w:val="left" w:leader="none" w:pos="1389"/>
-          <w:tab w:val="left" w:leader="none" w:pos="1672"/>
-        </w:tabs>
-        <w:spacing w:line="240" w:lineRule="auto"/>
-        <w:ind w:left="-90" w:right="-540" w:hanging="360"/>
-        <w:jc w:val="both"/>
-        <w:rPr>
-          <w:rFonts w:ascii="Calibri" w:cs="Calibri" w:eastAsia="Calibri" w:hAnsi="Calibri"/>
-          <w:b w:val="1"/>
-          <w:bCs w:val="1"/>
-          <w:sz w:val="24"/>
-          <w:szCs w:val="24"/>
-        </w:rPr>
-      </w:pPr>
-      <w:r>
-        <w:rPr>
-          <w:rFonts w:ascii="Calibri" w:cs="Calibri" w:eastAsia="Calibri" w:hAnsi="Calibri"/>
-          <w:sz w:val="24"/>
-          <w:szCs w:val="24"/>
-          <w:rtl w:val="0"/>
-        </w:rPr>
-        <w:t>Developed CI/CD pipelines using Jenkins and Gradle to automate builds, testing, and deployments, applying continuous integration and delivery best practices to improve development efficiency.</w:t>
+        <w:t>Developed Python scripts across the application lifecycle for backend automation and testing, including REST API validation, JSON payload checks, regression support, and deployment verification.</w:t>
+      </w:r>
+      <w:r>
+        <w:rPr>
+          <w:rtl w:val="0"/>
+        </w:rPr>
+      </w:r>
+    </w:p>
+    <w:p>
+      <w:pPr>
+        <w:numPr>
+          <w:ilvl w:val="0"/>
+          <w:numId w:val="1"/>
+        </w:numPr>
+        <w:tabs>
+          <w:tab w:val="left" w:leader="none" w:pos="926"/>
+          <w:tab w:val="left" w:leader="none" w:pos="1389"/>
+          <w:tab w:val="left" w:leader="none" w:pos="1672"/>
+        </w:tabs>
+        <w:spacing w:line="240" w:lineRule="auto"/>
+        <w:ind w:left="-90" w:right="-540" w:hanging="360"/>
+        <w:jc w:val="both"/>
+        <w:rPr>
+          <w:rFonts w:ascii="Calibri" w:cs="Calibri" w:eastAsia="Calibri" w:hAnsi="Calibri"/>
+          <w:b w:val="1"/>
+          <w:bCs w:val="1"/>
+          <w:sz w:val="24"/>
+          <w:szCs w:val="24"/>
+        </w:rPr>
+      </w:pPr>
+      <w:r>
+        <w:rPr>
+          <w:rFonts w:ascii="Calibri" w:cs="Calibri" w:eastAsia="Calibri" w:hAnsi="Calibri"/>
+          <w:sz w:val="24"/>
+          <w:szCs w:val="24"/>
+          <w:rtl w:val="0"/>
+        </w:rPr>
+        <w:t>Developed and maintained CI/CD pipelines using Jenkins and Gradle, authoring Bash shell scripts and cron jobs to automate builds, deployments, and scheduled tasks on Linux servers, while leveraging command-line tools for log analysis and Linux process management to troubleshoot pipeline failures and improve development efficiency.</w:t>
       </w:r>
       <w:r>
         <w:rPr>
@@ -2878,7 +2878,7 @@
           <w:szCs w:val="24"/>
           <w:rtl w:val="0"/>
         </w:rPr>
-        <w:t>Deployed and supported Java/Spring Boot microservices on GCP, integrating cloud services for messaging, storage, monitoring, and secure application access across distributed enterprise environments.</w:t>
+        <w:t xml:space="preserve">Hands-on experience deploying and supporting Java/Spring Boot microservices on GCP, integrating cloud services for messaging, storage, monitoring, and secure application access.</w:t>
       </w:r>
       <w:r>
         <w:rPr>
@@ -3025,7 +3025,7 @@
           <w:szCs w:val="24"/>
           <w:rtl w:val="0"/>
         </w:rPr>
-        <w:t xml:space="preserve">Collaborated with teams using Atlassian Confluence for project documentation and JIRA for tracking stories, tasks, and defects.</w:t>
+        <w:t>Drove cross-team communication and Agile delivery by using Atlassian JIRA to track stories, tasks, and defects, and Confluence to maintain clear, up-to-date project documentation.</w:t>
       </w:r>
       <w:r>
         <w:rPr>
@@ -3232,7 +3232,7 @@
           <w:szCs w:val="24"/>
           <w:rtl w:val="0"/>
         </w:rPr>
-        <w:t xml:space="preserve">Designed, engineered, and deployed scalable enterprise web applications and microservices inside an Agile development lifecycle, contributing to sprint planning, backlog refinement, and retrospectives.</w:t>
+        <w:t>Designed, engineered, and deployed scalable enterprise web applications and microservices within an Agile lifecycle while coordinating with offshore development teams across time zones — facilitating daily stand-ups, clarifying requirements, and mentoring junior offshore developers to ensure sprint commitments were met with consistent, high-quality delivery.</w:t>
       </w:r>
       <w:r>
         <w:rPr>
@@ -3294,7 +3294,7 @@
           <w:szCs w:val="24"/>
           <w:rtl w:val="0"/>
         </w:rPr>
-        <w:t>Leveraged the Spring Framework ecosystem — including Core, Boot, MVC, Batch, Security, AOP, and DAO modules — to construct highly modular, secure, and maintainable microservices with dependency injection and exception handling.</w:t>
+        <w:t xml:space="preserve">Leveraged the Spring Framework ecosystem including Core, Boot, MVC, Batch, Security, AOP, and DAO modules to construct highly modular, secure, and maintainable microservices.</w:t>
       </w:r>
       <w:r>
         <w:rPr>
@@ -3480,7 +3480,7 @@
           <w:szCs w:val="24"/>
           <w:rtl w:val="0"/>
         </w:rPr>
-        <w:t xml:space="preserve">Optimized storage performance through MongoDB index tuning and enhanced existing relational data structures by refactoring legacy Oracle PL/SQL stored procedures, views, and sequences.</w:t>
+        <w:t>Optimized application performance at Tenet Health by tuning JVM heap allocation, garbage collection policies (G1GC), and thread concurrency settings using JVisualVM and JProfiler to analyze runtime behavior and eliminate memory bottlenecks, while also improving storage-layer performance through MongoDB index tuning and refactoring legacy Oracle PL/SQL stored procedures, views, and sequences.</w:t>
       </w:r>
       <w:r>
         <w:rPr>

</xml_diff>